<commit_message>
updates to filter and relay labs
</commit_message>
<xml_diff>
--- a/electronics_manual/relays/relay_picture.docx
+++ b/electronics_manual/relays/relay_picture.docx
@@ -21,6 +21,674 @@
           <w:szCs w:val="24"/>
         </w:rPr>
       </w:pPr>
+      <w:r>
+        <w:rPr>
+          <w:rFonts w:ascii="Times New Roman" w:hAnsi="Times New Roman" w:cs="Times New Roman"/>
+          <w:noProof/>
+          <w:sz w:val="24"/>
+          <w:szCs w:val="24"/>
+        </w:rPr>
+        <mc:AlternateContent>
+          <mc:Choice Requires="wps">
+            <w:drawing>
+              <wp:anchor distT="0" distB="0" distL="114300" distR="114300" simplePos="0" relativeHeight="251719680" behindDoc="0" locked="0" layoutInCell="1" allowOverlap="1" wp14:anchorId="37B99CFC" wp14:editId="107C6D0A">
+                <wp:simplePos x="0" y="0"/>
+                <wp:positionH relativeFrom="column">
+                  <wp:posOffset>1177636</wp:posOffset>
+                </wp:positionH>
+                <wp:positionV relativeFrom="paragraph">
+                  <wp:posOffset>2721033</wp:posOffset>
+                </wp:positionV>
+                <wp:extent cx="2988945" cy="626918"/>
+                <wp:effectExtent l="0" t="0" r="0" b="1905"/>
+                <wp:wrapNone/>
+                <wp:docPr id="14184194" name="Text Box 2"/>
+                <wp:cNvGraphicFramePr/>
+                <a:graphic xmlns:a="http://schemas.openxmlformats.org/drawingml/2006/main">
+                  <a:graphicData uri="http://schemas.microsoft.com/office/word/2010/wordprocessingShape">
+                    <wps:wsp>
+                      <wps:cNvSpPr txBox="1"/>
+                      <wps:spPr>
+                        <a:xfrm>
+                          <a:off x="0" y="0"/>
+                          <a:ext cx="2988945" cy="626918"/>
+                        </a:xfrm>
+                        <a:prstGeom prst="rect">
+                          <a:avLst/>
+                        </a:prstGeom>
+                        <a:noFill/>
+                        <a:ln w="6350">
+                          <a:noFill/>
+                        </a:ln>
+                      </wps:spPr>
+                      <wps:txbx>
+                        <w:txbxContent>
+                          <w:p>
+                            <w:pPr>
+                              <w:spacing w:line="192" w:lineRule="auto"/>
+                              <w:rPr>
+                                <w:sz w:val="40"/>
+                                <w:szCs w:val="40"/>
+                              </w:rPr>
+                            </w:pPr>
+                            <w:r>
+                              <w:rPr>
+                                <w:sz w:val="40"/>
+                                <w:szCs w:val="40"/>
+                              </w:rPr>
+                              <w:t xml:space="preserve">16-pin socket; holds relay onto </w:t>
+                            </w:r>
+                            <w:r>
+                              <w:rPr>
+                                <w:sz w:val="44"/>
+                                <w:szCs w:val="44"/>
+                              </w:rPr>
+                              <w:t>breadboard</w:t>
+                            </w:r>
+                            <w:r>
+                              <w:rPr>
+                                <w:sz w:val="40"/>
+                                <w:szCs w:val="40"/>
+                              </w:rPr>
+                              <w:t xml:space="preserve"> securely</w:t>
+                            </w:r>
+                          </w:p>
+                        </w:txbxContent>
+                      </wps:txbx>
+                      <wps:bodyPr rot="0" spcFirstLastPara="0" vertOverflow="overflow" horzOverflow="overflow" vert="horz" wrap="square" lIns="91440" tIns="45720" rIns="91440" bIns="45720" numCol="1" spcCol="0" rtlCol="0" fromWordArt="0" anchor="t" anchorCtr="0" forceAA="0" compatLnSpc="1">
+                        <a:prstTxWarp prst="textNoShape">
+                          <a:avLst/>
+                        </a:prstTxWarp>
+                        <a:noAutofit/>
+                      </wps:bodyPr>
+                    </wps:wsp>
+                  </a:graphicData>
+                </a:graphic>
+                <wp14:sizeRelH relativeFrom="margin">
+                  <wp14:pctWidth>0</wp14:pctWidth>
+                </wp14:sizeRelH>
+                <wp14:sizeRelV relativeFrom="margin">
+                  <wp14:pctHeight>0</wp14:pctHeight>
+                </wp14:sizeRelV>
+              </wp:anchor>
+            </w:drawing>
+          </mc:Choice>
+          <mc:Fallback>
+            <w:pict>
+              <v:shapetype w14:anchorId="37B99CFC" id="_x0000_t202" coordsize="21600,21600" o:spt="202" path="m,l,21600r21600,l21600,xe">
+                <v:stroke joinstyle="miter"/>
+                <v:path gradientshapeok="t" o:connecttype="rect"/>
+              </v:shapetype>
+              <v:shape id="Text Box 2" o:spid="_x0000_s1026" type="#_x0000_t202" style="position:absolute;margin-left:92.75pt;margin-top:214.25pt;width:235.35pt;height:49.35pt;z-index:251719680;visibility:visible;mso-wrap-style:square;mso-width-percent:0;mso-height-percent:0;mso-wrap-distance-left:9pt;mso-wrap-distance-top:0;mso-wrap-distance-right:9pt;mso-wrap-distance-bottom:0;mso-position-horizontal:absolute;mso-position-horizontal-relative:text;mso-position-vertical:absolute;mso-position-vertical-relative:text;mso-width-percent:0;mso-height-percent:0;mso-width-relative:margin;mso-height-relative:margin;v-text-anchor:top" o:gfxdata="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" filled="f" stroked="f" strokeweight=".5pt">
+                <v:textbox>
+                  <w:txbxContent>
+                    <w:p>
+                      <w:pPr>
+                        <w:spacing w:line="192" w:lineRule="auto"/>
+                        <w:rPr>
+                          <w:sz w:val="40"/>
+                          <w:szCs w:val="40"/>
+                        </w:rPr>
+                      </w:pPr>
+                      <w:r>
+                        <w:rPr>
+                          <w:sz w:val="40"/>
+                          <w:szCs w:val="40"/>
+                        </w:rPr>
+                        <w:t xml:space="preserve">16-pin socket; holds relay onto </w:t>
+                      </w:r>
+                      <w:r>
+                        <w:rPr>
+                          <w:sz w:val="44"/>
+                          <w:szCs w:val="44"/>
+                        </w:rPr>
+                        <w:t>breadboard</w:t>
+                      </w:r>
+                      <w:r>
+                        <w:rPr>
+                          <w:sz w:val="40"/>
+                          <w:szCs w:val="40"/>
+                        </w:rPr>
+                        <w:t xml:space="preserve"> securely</w:t>
+                      </w:r>
+                    </w:p>
+                  </w:txbxContent>
+                </v:textbox>
+              </v:shape>
+            </w:pict>
+          </mc:Fallback>
+        </mc:AlternateContent>
+      </w:r>
+      <w:r>
+        <w:rPr>
+          <w:rFonts w:ascii="Times New Roman" w:hAnsi="Times New Roman" w:cs="Times New Roman"/>
+          <w:noProof/>
+          <w:sz w:val="24"/>
+          <w:szCs w:val="24"/>
+        </w:rPr>
+        <mc:AlternateContent>
+          <mc:Choice Requires="wps">
+            <w:drawing>
+              <wp:anchor distT="0" distB="0" distL="114300" distR="114300" simplePos="0" relativeHeight="251721728" behindDoc="0" locked="0" layoutInCell="1" allowOverlap="1" wp14:anchorId="796CFC5A" wp14:editId="73A83FF5">
+                <wp:simplePos x="0" y="0"/>
+                <wp:positionH relativeFrom="column">
+                  <wp:posOffset>683202</wp:posOffset>
+                </wp:positionH>
+                <wp:positionV relativeFrom="paragraph">
+                  <wp:posOffset>2194560</wp:posOffset>
+                </wp:positionV>
+                <wp:extent cx="488228" cy="688336"/>
+                <wp:effectExtent l="0" t="76200" r="26670" b="36195"/>
+                <wp:wrapNone/>
+                <wp:docPr id="1917097656" name="Freeform: Shape 4"/>
+                <wp:cNvGraphicFramePr/>
+                <a:graphic xmlns:a="http://schemas.openxmlformats.org/drawingml/2006/main">
+                  <a:graphicData uri="http://schemas.microsoft.com/office/word/2010/wordprocessingShape">
+                    <wps:wsp>
+                      <wps:cNvSpPr/>
+                      <wps:spPr>
+                        <a:xfrm>
+                          <a:off x="0" y="0"/>
+                          <a:ext cx="488228" cy="688336"/>
+                        </a:xfrm>
+                        <a:custGeom>
+                          <a:avLst/>
+                          <a:gdLst>
+                            <a:gd name="csX0" fmla="*/ 832331 w 832331"/>
+                            <a:gd name="csY0" fmla="*/ 813954 h 813954"/>
+                            <a:gd name="csX1" fmla="*/ 18376 w 832331"/>
+                            <a:gd name="csY1" fmla="*/ 339436 h 813954"/>
+                            <a:gd name="csX2" fmla="*/ 343958 w 832331"/>
+                            <a:gd name="csY2" fmla="*/ 0 h 813954"/>
+                            <a:gd name="csX0" fmla="*/ 741045 w 741045"/>
+                            <a:gd name="csY0" fmla="*/ 713445 h 713445"/>
+                            <a:gd name="csX1" fmla="*/ 13731 w 741045"/>
+                            <a:gd name="csY1" fmla="*/ 339436 h 713445"/>
+                            <a:gd name="csX2" fmla="*/ 339313 w 741045"/>
+                            <a:gd name="csY2" fmla="*/ 0 h 713445"/>
+                            <a:gd name="csX0" fmla="*/ 741045 w 741045"/>
+                            <a:gd name="csY0" fmla="*/ 713445 h 713487"/>
+                            <a:gd name="csX1" fmla="*/ 13731 w 741045"/>
+                            <a:gd name="csY1" fmla="*/ 339436 h 713487"/>
+                            <a:gd name="csX2" fmla="*/ 339313 w 741045"/>
+                            <a:gd name="csY2" fmla="*/ 0 h 713487"/>
+                            <a:gd name="csX0" fmla="*/ 751486 w 751486"/>
+                            <a:gd name="csY0" fmla="*/ 713445 h 713487"/>
+                            <a:gd name="csX1" fmla="*/ 24172 w 751486"/>
+                            <a:gd name="csY1" fmla="*/ 339436 h 713487"/>
+                            <a:gd name="csX2" fmla="*/ 349754 w 751486"/>
+                            <a:gd name="csY2" fmla="*/ 0 h 713487"/>
+                            <a:gd name="csX0" fmla="*/ 727467 w 727467"/>
+                            <a:gd name="csY0" fmla="*/ 713445 h 713500"/>
+                            <a:gd name="csX1" fmla="*/ 153 w 727467"/>
+                            <a:gd name="csY1" fmla="*/ 339436 h 713500"/>
+                            <a:gd name="csX2" fmla="*/ 325735 w 727467"/>
+                            <a:gd name="csY2" fmla="*/ 0 h 713500"/>
+                            <a:gd name="csX0" fmla="*/ 730311 w 730311"/>
+                            <a:gd name="csY0" fmla="*/ 713445 h 713494"/>
+                            <a:gd name="csX1" fmla="*/ 2997 w 730311"/>
+                            <a:gd name="csY1" fmla="*/ 339436 h 713494"/>
+                            <a:gd name="csX2" fmla="*/ 328579 w 730311"/>
+                            <a:gd name="csY2" fmla="*/ 0 h 713494"/>
+                            <a:gd name="csX0" fmla="*/ 707989 w 707989"/>
+                            <a:gd name="csY0" fmla="*/ 713445 h 713481"/>
+                            <a:gd name="csX1" fmla="*/ 4923 w 707989"/>
+                            <a:gd name="csY1" fmla="*/ 259730 h 713481"/>
+                            <a:gd name="csX2" fmla="*/ 306257 w 707989"/>
+                            <a:gd name="csY2" fmla="*/ 0 h 713481"/>
+                            <a:gd name="csX0" fmla="*/ 712423 w 712423"/>
+                            <a:gd name="csY0" fmla="*/ 713445 h 713495"/>
+                            <a:gd name="csX1" fmla="*/ 4434 w 712423"/>
+                            <a:gd name="csY1" fmla="*/ 346366 h 713495"/>
+                            <a:gd name="csX2" fmla="*/ 310691 w 712423"/>
+                            <a:gd name="csY2" fmla="*/ 0 h 713495"/>
+                            <a:gd name="csX0" fmla="*/ 726296 w 726296"/>
+                            <a:gd name="csY0" fmla="*/ 713445 h 713493"/>
+                            <a:gd name="csX1" fmla="*/ 18307 w 726296"/>
+                            <a:gd name="csY1" fmla="*/ 346366 h 713493"/>
+                            <a:gd name="csX2" fmla="*/ 324564 w 726296"/>
+                            <a:gd name="csY2" fmla="*/ 0 h 713493"/>
+                            <a:gd name="csX0" fmla="*/ 455950 w 455950"/>
+                            <a:gd name="csY0" fmla="*/ 689186 h 689240"/>
+                            <a:gd name="csX1" fmla="*/ 18307 w 455950"/>
+                            <a:gd name="csY1" fmla="*/ 346366 h 689240"/>
+                            <a:gd name="csX2" fmla="*/ 324564 w 455950"/>
+                            <a:gd name="csY2" fmla="*/ 0 h 689240"/>
+                            <a:gd name="csX0" fmla="*/ 489539 w 489539"/>
+                            <a:gd name="csY0" fmla="*/ 689186 h 689242"/>
+                            <a:gd name="csX1" fmla="*/ 13794 w 489539"/>
+                            <a:gd name="csY1" fmla="*/ 353302 h 689242"/>
+                            <a:gd name="csX2" fmla="*/ 358153 w 489539"/>
+                            <a:gd name="csY2" fmla="*/ 0 h 689242"/>
+                            <a:gd name="csX0" fmla="*/ 489539 w 489539"/>
+                            <a:gd name="csY0" fmla="*/ 689186 h 699135"/>
+                            <a:gd name="csX1" fmla="*/ 13794 w 489539"/>
+                            <a:gd name="csY1" fmla="*/ 353302 h 699135"/>
+                            <a:gd name="csX2" fmla="*/ 358153 w 489539"/>
+                            <a:gd name="csY2" fmla="*/ 0 h 699135"/>
+                            <a:gd name="csX0" fmla="*/ 489539 w 489539"/>
+                            <a:gd name="csY0" fmla="*/ 689186 h 689242"/>
+                            <a:gd name="csX1" fmla="*/ 13794 w 489539"/>
+                            <a:gd name="csY1" fmla="*/ 353302 h 689242"/>
+                            <a:gd name="csX2" fmla="*/ 358153 w 489539"/>
+                            <a:gd name="csY2" fmla="*/ 0 h 689242"/>
+                            <a:gd name="csX0" fmla="*/ 488249 w 488249"/>
+                            <a:gd name="csY0" fmla="*/ 689186 h 689236"/>
+                            <a:gd name="csX1" fmla="*/ 12504 w 488249"/>
+                            <a:gd name="csY1" fmla="*/ 353302 h 689236"/>
+                            <a:gd name="csX2" fmla="*/ 356863 w 488249"/>
+                            <a:gd name="csY2" fmla="*/ 0 h 689236"/>
+                          </a:gdLst>
+                          <a:ahLst/>
+                          <a:cxnLst>
+                            <a:cxn ang="0">
+                              <a:pos x="csX0" y="csY0"/>
+                            </a:cxn>
+                            <a:cxn ang="0">
+                              <a:pos x="csX1" y="csY1"/>
+                            </a:cxn>
+                            <a:cxn ang="0">
+                              <a:pos x="csX2" y="csY2"/>
+                            </a:cxn>
+                          </a:cxnLst>
+                          <a:rect l="l" t="t" r="r" b="b"/>
+                          <a:pathLst>
+                            <a:path w="488249" h="689236">
+                              <a:moveTo>
+                                <a:pt x="488249" y="689186"/>
+                              </a:moveTo>
+                              <a:cubicBezTo>
+                                <a:pt x="166997" y="693021"/>
+                                <a:pt x="55221" y="479127"/>
+                                <a:pt x="12504" y="353302"/>
+                              </a:cubicBezTo>
+                              <a:cubicBezTo>
+                                <a:pt x="-30213" y="227477"/>
+                                <a:pt x="25220" y="8318"/>
+                                <a:pt x="356863" y="0"/>
+                              </a:cubicBezTo>
+                            </a:path>
+                          </a:pathLst>
+                        </a:custGeom>
+                        <a:ln w="19050">
+                          <a:solidFill>
+                            <a:schemeClr val="tx1"/>
+                          </a:solidFill>
+                          <a:headEnd type="none" w="med" len="med"/>
+                          <a:tailEnd type="triangle" w="lg" len="lg"/>
+                        </a:ln>
+                      </wps:spPr>
+                      <wps:style>
+                        <a:lnRef idx="1">
+                          <a:schemeClr val="accent1"/>
+                        </a:lnRef>
+                        <a:fillRef idx="0">
+                          <a:schemeClr val="accent1"/>
+                        </a:fillRef>
+                        <a:effectRef idx="0">
+                          <a:schemeClr val="accent1"/>
+                        </a:effectRef>
+                        <a:fontRef idx="minor">
+                          <a:schemeClr val="tx1"/>
+                        </a:fontRef>
+                      </wps:style>
+                      <wps:bodyPr rot="0" spcFirstLastPara="0" vertOverflow="overflow" horzOverflow="overflow" vert="horz" wrap="square" lIns="91440" tIns="45720" rIns="91440" bIns="45720" numCol="1" spcCol="0" rtlCol="0" fromWordArt="0" anchor="ctr" anchorCtr="0" forceAA="0" compatLnSpc="1">
+                        <a:prstTxWarp prst="textNoShape">
+                          <a:avLst/>
+                        </a:prstTxWarp>
+                        <a:noAutofit/>
+                      </wps:bodyPr>
+                    </wps:wsp>
+                  </a:graphicData>
+                </a:graphic>
+                <wp14:sizeRelH relativeFrom="margin">
+                  <wp14:pctWidth>0</wp14:pctWidth>
+                </wp14:sizeRelH>
+                <wp14:sizeRelV relativeFrom="margin">
+                  <wp14:pctHeight>0</wp14:pctHeight>
+                </wp14:sizeRelV>
+              </wp:anchor>
+            </w:drawing>
+          </mc:Choice>
+          <mc:Fallback>
+            <w:pict>
+              <v:shape w14:anchorId="195F36D3" id="Freeform: Shape 4" o:spid="_x0000_s1026" style="position:absolute;margin-left:53.8pt;margin-top:172.8pt;width:38.45pt;height:54.2pt;z-index:251721728;visibility:visible;mso-wrap-style:square;mso-width-percent:0;mso-height-percent:0;mso-wrap-distance-left:9pt;mso-wrap-distance-top:0;mso-wrap-distance-right:9pt;mso-wrap-distance-bottom:0;mso-position-horizontal:absolute;mso-position-horizontal-relative:text;mso-position-vertical:absolute;mso-position-vertical-relative:text;mso-width-percent:0;mso-height-percent:0;mso-width-relative:margin;mso-height-relative:margin;v-text-anchor:middle" coordsize="488249,689236" o:gfxdata="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" path="m488249,689186c166997,693021,55221,479127,12504,353302,-30213,227477,25220,8318,356863,e" filled="f" strokecolor="black [3213]" strokeweight="1.5pt">
+                <v:stroke endarrow="block" endarrowwidth="wide" endarrowlength="long"/>
+                <v:path arrowok="t" o:connecttype="custom" o:connectlocs="488228,688286;12503,352841;356848,0" o:connectangles="0,0,0"/>
+              </v:shape>
+            </w:pict>
+          </mc:Fallback>
+        </mc:AlternateContent>
+      </w:r>
+      <w:r>
+        <w:rPr>
+          <w:rFonts w:ascii="Times New Roman" w:hAnsi="Times New Roman" w:cs="Times New Roman"/>
+          <w:noProof/>
+          <w:sz w:val="24"/>
+          <w:szCs w:val="24"/>
+        </w:rPr>
+        <mc:AlternateContent>
+          <mc:Choice Requires="wps">
+            <w:drawing>
+              <wp:anchor distT="0" distB="0" distL="114300" distR="114300" simplePos="0" relativeHeight="251717632" behindDoc="0" locked="0" layoutInCell="1" allowOverlap="1" wp14:anchorId="4881CE21" wp14:editId="436C0ED2">
+                <wp:simplePos x="0" y="0"/>
+                <wp:positionH relativeFrom="column">
+                  <wp:posOffset>391160</wp:posOffset>
+                </wp:positionH>
+                <wp:positionV relativeFrom="paragraph">
+                  <wp:posOffset>802178</wp:posOffset>
+                </wp:positionV>
+                <wp:extent cx="782609" cy="436418"/>
+                <wp:effectExtent l="0" t="0" r="0" b="1905"/>
+                <wp:wrapNone/>
+                <wp:docPr id="888594949" name="Text Box 2"/>
+                <wp:cNvGraphicFramePr/>
+                <a:graphic xmlns:a="http://schemas.openxmlformats.org/drawingml/2006/main">
+                  <a:graphicData uri="http://schemas.microsoft.com/office/word/2010/wordprocessingShape">
+                    <wps:wsp>
+                      <wps:cNvSpPr txBox="1"/>
+                      <wps:spPr>
+                        <a:xfrm>
+                          <a:off x="0" y="0"/>
+                          <a:ext cx="782609" cy="436418"/>
+                        </a:xfrm>
+                        <a:prstGeom prst="rect">
+                          <a:avLst/>
+                        </a:prstGeom>
+                        <a:noFill/>
+                        <a:ln w="6350">
+                          <a:noFill/>
+                        </a:ln>
+                      </wps:spPr>
+                      <wps:txbx>
+                        <w:txbxContent>
+                          <w:p>
+                            <w:pPr>
+                              <w:rPr>
+                                <w:sz w:val="36"/>
+                                <w:szCs w:val="36"/>
+                              </w:rPr>
+                            </w:pPr>
+                            <w:r>
+                              <w:rPr>
+                                <w:sz w:val="44"/>
+                                <w:szCs w:val="44"/>
+                              </w:rPr>
+                              <w:t>relay</w:t>
+                            </w:r>
+                          </w:p>
+                        </w:txbxContent>
+                      </wps:txbx>
+                      <wps:bodyPr rot="0" spcFirstLastPara="0" vertOverflow="overflow" horzOverflow="overflow" vert="horz" wrap="square" lIns="91440" tIns="45720" rIns="91440" bIns="45720" numCol="1" spcCol="0" rtlCol="0" fromWordArt="0" anchor="t" anchorCtr="0" forceAA="0" compatLnSpc="1">
+                        <a:prstTxWarp prst="textNoShape">
+                          <a:avLst/>
+                        </a:prstTxWarp>
+                        <a:noAutofit/>
+                      </wps:bodyPr>
+                    </wps:wsp>
+                  </a:graphicData>
+                </a:graphic>
+                <wp14:sizeRelH relativeFrom="margin">
+                  <wp14:pctWidth>0</wp14:pctWidth>
+                </wp14:sizeRelH>
+                <wp14:sizeRelV relativeFrom="margin">
+                  <wp14:pctHeight>0</wp14:pctHeight>
+                </wp14:sizeRelV>
+              </wp:anchor>
+            </w:drawing>
+          </mc:Choice>
+          <mc:Fallback>
+            <w:pict>
+              <v:shape w14:anchorId="4881CE21" id="_x0000_s1027" type="#_x0000_t202" style="position:absolute;margin-left:30.8pt;margin-top:63.15pt;width:61.6pt;height:34.35pt;z-index:251717632;visibility:visible;mso-wrap-style:square;mso-width-percent:0;mso-height-percent:0;mso-wrap-distance-left:9pt;mso-wrap-distance-top:0;mso-wrap-distance-right:9pt;mso-wrap-distance-bottom:0;mso-position-horizontal:absolute;mso-position-horizontal-relative:text;mso-position-vertical:absolute;mso-position-vertical-relative:text;mso-width-percent:0;mso-height-percent:0;mso-width-relative:margin;mso-height-relative:margin;v-text-anchor:top" o:gfxdata="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" filled="f" stroked="f" strokeweight=".5pt">
+                <v:textbox>
+                  <w:txbxContent>
+                    <w:p>
+                      <w:pPr>
+                        <w:rPr>
+                          <w:sz w:val="36"/>
+                          <w:szCs w:val="36"/>
+                        </w:rPr>
+                      </w:pPr>
+                      <w:r>
+                        <w:rPr>
+                          <w:sz w:val="44"/>
+                          <w:szCs w:val="44"/>
+                        </w:rPr>
+                        <w:t>relay</w:t>
+                      </w:r>
+                    </w:p>
+                  </w:txbxContent>
+                </v:textbox>
+              </v:shape>
+            </w:pict>
+          </mc:Fallback>
+        </mc:AlternateContent>
+      </w:r>
+      <w:r>
+        <w:rPr>
+          <w:rFonts w:ascii="Times New Roman" w:hAnsi="Times New Roman" w:cs="Times New Roman"/>
+          <w:noProof/>
+          <w:sz w:val="24"/>
+          <w:szCs w:val="24"/>
+        </w:rPr>
+        <mc:AlternateContent>
+          <mc:Choice Requires="wps">
+            <w:drawing>
+              <wp:anchor distT="0" distB="0" distL="114300" distR="114300" simplePos="0" relativeHeight="251714560" behindDoc="0" locked="0" layoutInCell="1" allowOverlap="1" wp14:anchorId="74D684F4" wp14:editId="4B0E3510">
+                <wp:simplePos x="0" y="0"/>
+                <wp:positionH relativeFrom="column">
+                  <wp:posOffset>1101436</wp:posOffset>
+                </wp:positionH>
+                <wp:positionV relativeFrom="paragraph">
+                  <wp:posOffset>494375</wp:posOffset>
+                </wp:positionV>
+                <wp:extent cx="224790" cy="1132263"/>
+                <wp:effectExtent l="0" t="0" r="22860" b="10795"/>
+                <wp:wrapNone/>
+                <wp:docPr id="866224275" name="Left Brace 1"/>
+                <wp:cNvGraphicFramePr/>
+                <a:graphic xmlns:a="http://schemas.openxmlformats.org/drawingml/2006/main">
+                  <a:graphicData uri="http://schemas.microsoft.com/office/word/2010/wordprocessingShape">
+                    <wps:wsp>
+                      <wps:cNvSpPr/>
+                      <wps:spPr>
+                        <a:xfrm>
+                          <a:off x="0" y="0"/>
+                          <a:ext cx="224790" cy="1132263"/>
+                        </a:xfrm>
+                        <a:prstGeom prst="leftBrace">
+                          <a:avLst>
+                            <a:gd name="adj1" fmla="val 34527"/>
+                            <a:gd name="adj2" fmla="val 50000"/>
+                          </a:avLst>
+                        </a:prstGeom>
+                        <a:ln w="25400">
+                          <a:solidFill>
+                            <a:schemeClr val="tx1"/>
+                          </a:solidFill>
+                        </a:ln>
+                      </wps:spPr>
+                      <wps:style>
+                        <a:lnRef idx="1">
+                          <a:schemeClr val="accent1"/>
+                        </a:lnRef>
+                        <a:fillRef idx="0">
+                          <a:schemeClr val="accent1"/>
+                        </a:fillRef>
+                        <a:effectRef idx="0">
+                          <a:schemeClr val="accent1"/>
+                        </a:effectRef>
+                        <a:fontRef idx="minor">
+                          <a:schemeClr val="tx1"/>
+                        </a:fontRef>
+                      </wps:style>
+                      <wps:txbx>
+                        <w:txbxContent>
+                          <w:p>
+                            <w:pPr>
+                              <w:jc w:val="center"/>
+                            </w:pPr>
+                          </w:p>
+                        </w:txbxContent>
+                      </wps:txbx>
+                      <wps:bodyPr rot="0" spcFirstLastPara="0" vertOverflow="overflow" horzOverflow="overflow" vert="horz" wrap="square" lIns="91440" tIns="45720" rIns="91440" bIns="45720" numCol="1" spcCol="0" rtlCol="0" fromWordArt="0" anchor="ctr" anchorCtr="0" forceAA="0" compatLnSpc="1">
+                        <a:prstTxWarp prst="textNoShape">
+                          <a:avLst/>
+                        </a:prstTxWarp>
+                        <a:noAutofit/>
+                      </wps:bodyPr>
+                    </wps:wsp>
+                  </a:graphicData>
+                </a:graphic>
+                <wp14:sizeRelH relativeFrom="margin">
+                  <wp14:pctWidth>0</wp14:pctWidth>
+                </wp14:sizeRelH>
+                <wp14:sizeRelV relativeFrom="margin">
+                  <wp14:pctHeight>0</wp14:pctHeight>
+                </wp14:sizeRelV>
+              </wp:anchor>
+            </w:drawing>
+          </mc:Choice>
+          <mc:Fallback>
+            <w:pict>
+              <v:shapetype w14:anchorId="74D684F4" id="_x0000_t87" coordsize="21600,21600" o:spt="87" adj="1800,10800" path="m21600,qx10800@0l10800@2qy0@11,10800@3l10800@1qy21600,21600e" filled="f">
+                <v:formulas>
+                  <v:f eqn="val #0"/>
+                  <v:f eqn="sum 21600 0 #0"/>
+                  <v:f eqn="sum #1 0 #0"/>
+                  <v:f eqn="sum #1 #0 0"/>
+                  <v:f eqn="prod #0 9598 32768"/>
+                  <v:f eqn="sum 21600 0 @4"/>
+                  <v:f eqn="sum 21600 0 #1"/>
+                  <v:f eqn="min #1 @6"/>
+                  <v:f eqn="prod @7 1 2"/>
+                  <v:f eqn="prod #0 2 1"/>
+                  <v:f eqn="sum 21600 0 @9"/>
+                  <v:f eqn="val #1"/>
+                </v:formulas>
+                <v:path arrowok="t" o:connecttype="custom" o:connectlocs="21600,0;0,10800;21600,21600" textboxrect="13963,@4,21600,@5"/>
+                <v:handles>
+                  <v:h position="center,#0" yrange="0,@8"/>
+                  <v:h position="topLeft,#1" yrange="@9,@10"/>
+                </v:handles>
+              </v:shapetype>
+              <v:shape id="Left Brace 1" o:spid="_x0000_s1028" type="#_x0000_t87" style="position:absolute;margin-left:86.75pt;margin-top:38.95pt;width:17.7pt;height:89.15pt;z-index:251714560;visibility:visible;mso-wrap-style:square;mso-width-percent:0;mso-height-percent:0;mso-wrap-distance-left:9pt;mso-wrap-distance-top:0;mso-wrap-distance-right:9pt;mso-wrap-distance-bottom:0;mso-position-horizontal:absolute;mso-position-horizontal-relative:text;mso-position-vertical:absolute;mso-position-vertical-relative:text;mso-width-percent:0;mso-height-percent:0;mso-width-relative:margin;mso-height-relative:margin;v-text-anchor:middle" o:gfxdata="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" adj="1481" strokecolor="black [3213]" strokeweight="2pt">
+                <v:textbox>
+                  <w:txbxContent>
+                    <w:p>
+                      <w:pPr>
+                        <w:jc w:val="center"/>
+                      </w:pPr>
+                    </w:p>
+                  </w:txbxContent>
+                </v:textbox>
+              </v:shape>
+            </w:pict>
+          </mc:Fallback>
+        </mc:AlternateContent>
+      </w:r>
+      <w:r>
+        <w:rPr>
+          <w:rFonts w:ascii="Times New Roman" w:hAnsi="Times New Roman" w:cs="Times New Roman"/>
+          <w:noProof/>
+          <w:sz w:val="24"/>
+          <w:szCs w:val="24"/>
+        </w:rPr>
+        <mc:AlternateContent>
+          <mc:Choice Requires="wps">
+            <w:drawing>
+              <wp:anchor distT="0" distB="0" distL="114300" distR="114300" simplePos="0" relativeHeight="251716608" behindDoc="0" locked="0" layoutInCell="1" allowOverlap="1" wp14:anchorId="4D9AF882" wp14:editId="121E346B">
+                <wp:simplePos x="0" y="0"/>
+                <wp:positionH relativeFrom="column">
+                  <wp:posOffset>1101090</wp:posOffset>
+                </wp:positionH>
+                <wp:positionV relativeFrom="paragraph">
+                  <wp:posOffset>1855470</wp:posOffset>
+                </wp:positionV>
+                <wp:extent cx="224790" cy="671946"/>
+                <wp:effectExtent l="0" t="0" r="22860" b="13970"/>
+                <wp:wrapNone/>
+                <wp:docPr id="247054682" name="Left Brace 1"/>
+                <wp:cNvGraphicFramePr/>
+                <a:graphic xmlns:a="http://schemas.openxmlformats.org/drawingml/2006/main">
+                  <a:graphicData uri="http://schemas.microsoft.com/office/word/2010/wordprocessingShape">
+                    <wps:wsp>
+                      <wps:cNvSpPr/>
+                      <wps:spPr>
+                        <a:xfrm>
+                          <a:off x="0" y="0"/>
+                          <a:ext cx="224790" cy="671946"/>
+                        </a:xfrm>
+                        <a:prstGeom prst="leftBrace">
+                          <a:avLst>
+                            <a:gd name="adj1" fmla="val 34527"/>
+                            <a:gd name="adj2" fmla="val 50000"/>
+                          </a:avLst>
+                        </a:prstGeom>
+                        <a:ln w="25400">
+                          <a:solidFill>
+                            <a:schemeClr val="tx1"/>
+                          </a:solidFill>
+                        </a:ln>
+                      </wps:spPr>
+                      <wps:style>
+                        <a:lnRef idx="1">
+                          <a:schemeClr val="accent1"/>
+                        </a:lnRef>
+                        <a:fillRef idx="0">
+                          <a:schemeClr val="accent1"/>
+                        </a:fillRef>
+                        <a:effectRef idx="0">
+                          <a:schemeClr val="accent1"/>
+                        </a:effectRef>
+                        <a:fontRef idx="minor">
+                          <a:schemeClr val="tx1"/>
+                        </a:fontRef>
+                      </wps:style>
+                      <wps:txbx>
+                        <w:txbxContent>
+                          <w:p>
+                            <w:pPr>
+                              <w:jc w:val="center"/>
+                            </w:pPr>
+                          </w:p>
+                        </w:txbxContent>
+                      </wps:txbx>
+                      <wps:bodyPr rot="0" spcFirstLastPara="0" vertOverflow="overflow" horzOverflow="overflow" vert="horz" wrap="square" lIns="91440" tIns="45720" rIns="91440" bIns="45720" numCol="1" spcCol="0" rtlCol="0" fromWordArt="0" anchor="ctr" anchorCtr="0" forceAA="0" compatLnSpc="1">
+                        <a:prstTxWarp prst="textNoShape">
+                          <a:avLst/>
+                        </a:prstTxWarp>
+                        <a:noAutofit/>
+                      </wps:bodyPr>
+                    </wps:wsp>
+                  </a:graphicData>
+                </a:graphic>
+                <wp14:sizeRelH relativeFrom="margin">
+                  <wp14:pctWidth>0</wp14:pctWidth>
+                </wp14:sizeRelH>
+                <wp14:sizeRelV relativeFrom="margin">
+                  <wp14:pctHeight>0</wp14:pctHeight>
+                </wp14:sizeRelV>
+              </wp:anchor>
+            </w:drawing>
+          </mc:Choice>
+          <mc:Fallback>
+            <w:pict>
+              <v:shape w14:anchorId="4D9AF882" id="_x0000_s1029" type="#_x0000_t87" style="position:absolute;margin-left:86.7pt;margin-top:146.1pt;width:17.7pt;height:52.9pt;z-index:251716608;visibility:visible;mso-wrap-style:square;mso-width-percent:0;mso-height-percent:0;mso-wrap-distance-left:9pt;mso-wrap-distance-top:0;mso-wrap-distance-right:9pt;mso-wrap-distance-bottom:0;mso-position-horizontal:absolute;mso-position-horizontal-relative:text;mso-position-vertical:absolute;mso-position-vertical-relative:text;mso-width-percent:0;mso-height-percent:0;mso-width-relative:margin;mso-height-relative:margin;v-text-anchor:middle" o:gfxdata="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" adj="2495" strokecolor="black [3213]" strokeweight="2pt">
+                <v:textbox>
+                  <w:txbxContent>
+                    <w:p>
+                      <w:pPr>
+                        <w:jc w:val="center"/>
+                      </w:pPr>
+                    </w:p>
+                  </w:txbxContent>
+                </v:textbox>
+              </v:shape>
+            </w:pict>
+          </mc:Fallback>
+        </mc:AlternateContent>
+      </w:r>
       <w:r>
         <w:rPr>
           <w:rFonts w:ascii="Times New Roman" w:hAnsi="Times New Roman" w:cs="Times New Roman"/>
@@ -4761,6 +5429,56 @@
 </w:document>
 </file>
 
+<file path=word/endnotes.xml><?xml version="1.0" encoding="utf-8"?>
+<w:endnotes xmlns:wpc="http://schemas.microsoft.com/office/word/2010/wordprocessingCanvas" xmlns:cx="http://schemas.microsoft.com/office/drawing/2014/chartex" xmlns:cx1="http://schemas.microsoft.com/office/drawing/2015/9/8/chartex" xmlns:cx2="http://schemas.microsoft.com/office/drawing/2015/10/21/chartex" xmlns:cx3="http://schemas.microsoft.com/office/drawing/2016/5/9/chartex" xmlns:cx4="http://schemas.microsoft.com/office/drawing/2016/5/10/chartex" xmlns:cx5="http://schemas.microsoft.com/office/drawing/2016/5/11/chartex" xmlns:cx6="http://schemas.microsoft.com/office/drawing/2016/5/12/chartex" xmlns:cx7="http://schemas.microsoft.com/office/drawing/2016/5/13/chartex" xmlns:cx8="http://schemas.microsoft.com/office/drawing/2016/5/14/chartex" xmlns:mc="http://schemas.openxmlformats.org/markup-compatibility/2006" xmlns:aink="http://schemas.microsoft.com/office/drawing/2016/ink" xmlns:am3d="http://schemas.microsoft.com/office/drawing/2017/model3d" xmlns:o="urn:schemas-microsoft-com:office:office" xmlns:oel="http://schemas.microsoft.com/office/2019/extlst" xmlns:r="http://schemas.openxmlformats.org/officeDocument/2006/relationships" xmlns:m="http://schemas.openxmlformats.org/officeDocument/2006/math" xmlns:v="urn:schemas-microsoft-com:vml" xmlns:wp14="http://schemas.microsoft.com/office/word/2010/wordprocessingDrawing" xmlns:wp="http://schemas.openxmlformats.org/drawingml/2006/wordprocessingDrawing" xmlns:w10="urn:schemas-microsoft-com:office:word" xmlns:w="http://schemas.openxmlformats.org/wordprocessingml/2006/main" xmlns:w14="http://schemas.microsoft.com/office/word/2010/wordml" xmlns:w15="http://schemas.microsoft.com/office/word/2012/wordml" xmlns:w16cex="http://schemas.microsoft.com/office/word/2018/wordml/cex" xmlns:w16cid="http://schemas.microsoft.com/office/word/2016/wordml/cid" xmlns:w16="http://schemas.microsoft.com/office/word/2018/wordml" xmlns:w16du="http://schemas.microsoft.com/office/word/2023/wordml/word16du" xmlns:w16sdtdh="http://schemas.microsoft.com/office/word/2020/wordml/sdtdatahash" xmlns:w16sdtfl="http://schemas.microsoft.com/office/word/2024/wordml/sdtformatlock" xmlns:w16se="http://schemas.microsoft.com/office/word/2015/wordml/symex" xmlns:wpg="http://schemas.microsoft.com/office/word/2010/wordprocessingGroup" xmlns:wpi="http://schemas.microsoft.com/office/word/2010/wordprocessingInk" xmlns:wne="http://schemas.microsoft.com/office/word/2006/wordml" xmlns:wps="http://schemas.microsoft.com/office/word/2010/wordprocessingShape" mc:Ignorable="w14 w15 w16se w16cid w16 w16cex w16sdtdh w16sdtfl w16du wp14">
+  <w:endnote w:type="separator" w:id="-1">
+    <w:p>
+      <w:pPr>
+        <w:spacing w:after="0" w:line="240" w:lineRule="auto"/>
+      </w:pPr>
+      <w:r>
+        <w:separator/>
+      </w:r>
+    </w:p>
+  </w:endnote>
+  <w:endnote w:type="continuationSeparator" w:id="0">
+    <w:p>
+      <w:pPr>
+        <w:spacing w:after="0" w:line="240" w:lineRule="auto"/>
+      </w:pPr>
+      <w:r>
+        <w:continuationSeparator/>
+      </w:r>
+    </w:p>
+  </w:endnote>
+</w:endnotes>
+</file>
+
+<file path=word/footnotes.xml><?xml version="1.0" encoding="utf-8"?>
+<w:footnotes xmlns:wpc="http://schemas.microsoft.com/office/word/2010/wordprocessingCanvas" xmlns:cx="http://schemas.microsoft.com/office/drawing/2014/chartex" xmlns:cx1="http://schemas.microsoft.com/office/drawing/2015/9/8/chartex" xmlns:cx2="http://schemas.microsoft.com/office/drawing/2015/10/21/chartex" xmlns:cx3="http://schemas.microsoft.com/office/drawing/2016/5/9/chartex" xmlns:cx4="http://schemas.microsoft.com/office/drawing/2016/5/10/chartex" xmlns:cx5="http://schemas.microsoft.com/office/drawing/2016/5/11/chartex" xmlns:cx6="http://schemas.microsoft.com/office/drawing/2016/5/12/chartex" xmlns:cx7="http://schemas.microsoft.com/office/drawing/2016/5/13/chartex" xmlns:cx8="http://schemas.microsoft.com/office/drawing/2016/5/14/chartex" xmlns:mc="http://schemas.openxmlformats.org/markup-compatibility/2006" xmlns:aink="http://schemas.microsoft.com/office/drawing/2016/ink" xmlns:am3d="http://schemas.microsoft.com/office/drawing/2017/model3d" xmlns:o="urn:schemas-microsoft-com:office:office" xmlns:oel="http://schemas.microsoft.com/office/2019/extlst" xmlns:r="http://schemas.openxmlformats.org/officeDocument/2006/relationships" xmlns:m="http://schemas.openxmlformats.org/officeDocument/2006/math" xmlns:v="urn:schemas-microsoft-com:vml" xmlns:wp14="http://schemas.microsoft.com/office/word/2010/wordprocessingDrawing" xmlns:wp="http://schemas.openxmlformats.org/drawingml/2006/wordprocessingDrawing" xmlns:w10="urn:schemas-microsoft-com:office:word" xmlns:w="http://schemas.openxmlformats.org/wordprocessingml/2006/main" xmlns:w14="http://schemas.microsoft.com/office/word/2010/wordml" xmlns:w15="http://schemas.microsoft.com/office/word/2012/wordml" xmlns:w16cex="http://schemas.microsoft.com/office/word/2018/wordml/cex" xmlns:w16cid="http://schemas.microsoft.com/office/word/2016/wordml/cid" xmlns:w16="http://schemas.microsoft.com/office/word/2018/wordml" xmlns:w16du="http://schemas.microsoft.com/office/word/2023/wordml/word16du" xmlns:w16sdtdh="http://schemas.microsoft.com/office/word/2020/wordml/sdtdatahash" xmlns:w16sdtfl="http://schemas.microsoft.com/office/word/2024/wordml/sdtformatlock" xmlns:w16se="http://schemas.microsoft.com/office/word/2015/wordml/symex" xmlns:wpg="http://schemas.microsoft.com/office/word/2010/wordprocessingGroup" xmlns:wpi="http://schemas.microsoft.com/office/word/2010/wordprocessingInk" xmlns:wne="http://schemas.microsoft.com/office/word/2006/wordml" xmlns:wps="http://schemas.microsoft.com/office/word/2010/wordprocessingShape" mc:Ignorable="w14 w15 w16se w16cid w16 w16cex w16sdtdh w16sdtfl w16du wp14">
+  <w:footnote w:type="separator" w:id="-1">
+    <w:p>
+      <w:pPr>
+        <w:spacing w:after="0" w:line="240" w:lineRule="auto"/>
+      </w:pPr>
+      <w:r>
+        <w:separator/>
+      </w:r>
+    </w:p>
+  </w:footnote>
+  <w:footnote w:type="continuationSeparator" w:id="0">
+    <w:p>
+      <w:pPr>
+        <w:spacing w:after="0" w:line="240" w:lineRule="auto"/>
+      </w:pPr>
+      <w:r>
+        <w:continuationSeparator/>
+      </w:r>
+    </w:p>
+  </w:footnote>
+</w:footnotes>
+</file>
+
 <file path=word/styles.xml><?xml version="1.0" encoding="utf-8"?>
 <w:styles xmlns:mc="http://schemas.openxmlformats.org/markup-compatibility/2006" xmlns:r="http://schemas.openxmlformats.org/officeDocument/2006/relationships" xmlns:w="http://schemas.openxmlformats.org/wordprocessingml/2006/main" xmlns:w14="http://schemas.microsoft.com/office/word/2010/wordml" xmlns:w15="http://schemas.microsoft.com/office/word/2012/wordml" xmlns:w16cex="http://schemas.microsoft.com/office/word/2018/wordml/cex" xmlns:w16cid="http://schemas.microsoft.com/office/word/2016/wordml/cid" xmlns:w16="http://schemas.microsoft.com/office/word/2018/wordml" xmlns:w16du="http://schemas.microsoft.com/office/word/2023/wordml/word16du" xmlns:w16sdtdh="http://schemas.microsoft.com/office/word/2020/wordml/sdtdatahash" xmlns:w16sdtfl="http://schemas.microsoft.com/office/word/2024/wordml/sdtformatlock" xmlns:w16se="http://schemas.microsoft.com/office/word/2015/wordml/symex" mc:Ignorable="w14 w15 w16se w16cid w16 w16cex w16sdtdh w16sdtfl w16du">
   <w:docDefaults>
@@ -5161,6 +5879,7 @@
   <w:style w:type="paragraph" w:default="1" w:styleId="Normal">
     <w:name w:val="Normal"/>
     <w:qFormat/>
+    <w:rsid w:val="00147A3A"/>
   </w:style>
   <w:style w:type="paragraph" w:styleId="Heading1">
     <w:name w:val="heading 1"/>
@@ -5364,6 +6083,7 @@
   <w:style w:type="character" w:default="1" w:styleId="DefaultParagraphFont">
     <w:name w:val="Default Paragraph Font"/>
     <w:uiPriority w:val="1"/>
+    <w:semiHidden/>
     <w:unhideWhenUsed/>
   </w:style>
   <w:style w:type="table" w:default="1" w:styleId="TableNormal">
@@ -5678,6 +6398,50 @@
       <w:spacing w:val="5"/>
     </w:rPr>
   </w:style>
+  <w:style w:type="paragraph" w:styleId="Header">
+    <w:name w:val="header"/>
+    <w:basedOn w:val="Normal"/>
+    <w:link w:val="HeaderChar"/>
+    <w:uiPriority w:val="99"/>
+    <w:unhideWhenUsed/>
+    <w:rsid w:val="00147A3A"/>
+    <w:pPr>
+      <w:tabs>
+        <w:tab w:val="center" w:pos="4680"/>
+        <w:tab w:val="right" w:pos="9360"/>
+      </w:tabs>
+      <w:spacing w:after="0" w:line="240" w:lineRule="auto"/>
+    </w:pPr>
+  </w:style>
+  <w:style w:type="character" w:customStyle="1" w:styleId="HeaderChar">
+    <w:name w:val="Header Char"/>
+    <w:basedOn w:val="DefaultParagraphFont"/>
+    <w:link w:val="Header"/>
+    <w:uiPriority w:val="99"/>
+    <w:rsid w:val="00147A3A"/>
+  </w:style>
+  <w:style w:type="paragraph" w:styleId="Footer">
+    <w:name w:val="footer"/>
+    <w:basedOn w:val="Normal"/>
+    <w:link w:val="FooterChar"/>
+    <w:uiPriority w:val="99"/>
+    <w:unhideWhenUsed/>
+    <w:rsid w:val="00147A3A"/>
+    <w:pPr>
+      <w:tabs>
+        <w:tab w:val="center" w:pos="4680"/>
+        <w:tab w:val="right" w:pos="9360"/>
+      </w:tabs>
+      <w:spacing w:after="0" w:line="240" w:lineRule="auto"/>
+    </w:pPr>
+  </w:style>
+  <w:style w:type="character" w:customStyle="1" w:styleId="FooterChar">
+    <w:name w:val="Footer Char"/>
+    <w:basedOn w:val="DefaultParagraphFont"/>
+    <w:link w:val="Footer"/>
+    <w:uiPriority w:val="99"/>
+    <w:rsid w:val="00147A3A"/>
+  </w:style>
 </w:styles>
 </file>
 

</xml_diff>